<commit_message>
Added stack and queue implementation
</commit_message>
<xml_diff>
--- a/Lecture-25-Pointers-in-Cpp/Pointer in Cpp (AutoRecovered).docx
+++ b/Lecture-25-Pointers-in-Cpp/Pointer in Cpp (AutoRecovered).docx
@@ -16,8 +16,21 @@
     </w:p>
     <w:p>
       <w:r>
-        <w:t>What is a pointers</w:t>
-      </w:r>
+        <w:t xml:space="preserve">What </w:t>
+      </w:r>
+      <w:proofErr w:type="gramStart"/>
+      <w:r>
+        <w:t>is</w:t>
+      </w:r>
+      <w:proofErr w:type="gramEnd"/>
+      <w:r>
+        <w:t xml:space="preserve"> a </w:t>
+      </w:r>
+      <w:proofErr w:type="gramStart"/>
+      <w:r>
+        <w:t>pointers</w:t>
+      </w:r>
+      <w:proofErr w:type="gramEnd"/>
     </w:p>
     <w:p>
       <w:r>
@@ -56,18 +69,68 @@
     </w:p>
     <w:p>
       <w:r>
-        <w:t>Int *ptr= &amp;num;</w:t>
-      </w:r>
-    </w:p>
-    <w:p/>
-    <w:p>
-      <w:r>
-        <w:t>Int arr[10];</w:t>
-      </w:r>
-    </w:p>
-    <w:p>
-      <w:r>
-        <w:t>Address of first memory block is using  cout&lt;&lt;arr&lt;&lt;endl;</w:t>
+        <w:t>Int *</w:t>
+      </w:r>
+      <w:proofErr w:type="spellStart"/>
+      <w:r>
+        <w:t>ptr</w:t>
+      </w:r>
+      <w:proofErr w:type="spellEnd"/>
+      <w:r>
+        <w:t>= &amp;num;</w:t>
+      </w:r>
+    </w:p>
+    <w:p/>
+    <w:p>
+      <w:r>
+        <w:t xml:space="preserve">Int </w:t>
+      </w:r>
+      <w:proofErr w:type="spellStart"/>
+      <w:proofErr w:type="gramStart"/>
+      <w:r>
+        <w:t>arr</w:t>
+      </w:r>
+      <w:proofErr w:type="spellEnd"/>
+      <w:r>
+        <w:t>[</w:t>
+      </w:r>
+      <w:proofErr w:type="gramEnd"/>
+      <w:r>
+        <w:t>10];</w:t>
+      </w:r>
+    </w:p>
+    <w:p>
+      <w:r>
+        <w:t xml:space="preserve">Address of first memory block is </w:t>
+      </w:r>
+      <w:proofErr w:type="gramStart"/>
+      <w:r>
+        <w:t xml:space="preserve">using  </w:t>
+      </w:r>
+      <w:proofErr w:type="spellStart"/>
+      <w:r>
+        <w:t>cout</w:t>
+      </w:r>
+      <w:proofErr w:type="spellEnd"/>
+      <w:proofErr w:type="gramEnd"/>
+      <w:r>
+        <w:t>&lt;&lt;</w:t>
+      </w:r>
+      <w:proofErr w:type="spellStart"/>
+      <w:r>
+        <w:t>arr</w:t>
+      </w:r>
+      <w:proofErr w:type="spellEnd"/>
+      <w:r>
+        <w:t>&lt;&lt;</w:t>
+      </w:r>
+      <w:proofErr w:type="spellStart"/>
+      <w:r>
+        <w:t>endl</w:t>
+      </w:r>
+      <w:proofErr w:type="spellEnd"/>
+      <w:r>
+        <w:t>;</w:t>
       </w:r>
     </w:p>
     <w:p/>
@@ -83,12 +146,44 @@
     </w:p>
     <w:p>
       <w:r>
-        <w:t>Arr[i]=*(arr+i)</w:t>
-      </w:r>
-    </w:p>
-    <w:p>
-      <w:r>
-        <w:t>I[arr] = * (i+arr)</w:t>
+        <w:t>Arr[</w:t>
+      </w:r>
+      <w:proofErr w:type="spellStart"/>
+      <w:r>
+        <w:t>i</w:t>
+      </w:r>
+      <w:proofErr w:type="spellEnd"/>
+      <w:r>
+        <w:t>]=*(</w:t>
+      </w:r>
+      <w:proofErr w:type="spellStart"/>
+      <w:r>
+        <w:t>arr+i</w:t>
+      </w:r>
+      <w:proofErr w:type="spellEnd"/>
+      <w:r>
+        <w:t>)</w:t>
+      </w:r>
+    </w:p>
+    <w:p>
+      <w:r>
+        <w:t>I[</w:t>
+      </w:r>
+      <w:proofErr w:type="spellStart"/>
+      <w:r>
+        <w:t>arr</w:t>
+      </w:r>
+      <w:proofErr w:type="spellEnd"/>
+      <w:r>
+        <w:t>] = * (</w:t>
+      </w:r>
+      <w:proofErr w:type="spellStart"/>
+      <w:r>
+        <w:t>i+arr</w:t>
+      </w:r>
+      <w:proofErr w:type="spellEnd"/>
+      <w:r>
+        <w:t>)</w:t>
       </w:r>
     </w:p>
     <w:p/>
@@ -106,12 +201,38 @@
         </w:numPr>
       </w:pPr>
       <w:r>
-        <w:t>BTS int arr[10]</w:t>
-      </w:r>
-    </w:p>
-    <w:p>
-      <w:r>
-        <w:t>Int *o = &amp;arr[0];</w:t>
+        <w:t xml:space="preserve">BTS int </w:t>
+      </w:r>
+      <w:proofErr w:type="spellStart"/>
+      <w:proofErr w:type="gramStart"/>
+      <w:r>
+        <w:t>arr</w:t>
+      </w:r>
+      <w:proofErr w:type="spellEnd"/>
+      <w:r>
+        <w:t>[</w:t>
+      </w:r>
+      <w:proofErr w:type="gramEnd"/>
+      <w:r>
+        <w:t>10]</w:t>
+      </w:r>
+    </w:p>
+    <w:p>
+      <w:r>
+        <w:t>Int *o = &amp;</w:t>
+      </w:r>
+      <w:proofErr w:type="spellStart"/>
+      <w:proofErr w:type="gramStart"/>
+      <w:r>
+        <w:t>arr</w:t>
+      </w:r>
+      <w:proofErr w:type="spellEnd"/>
+      <w:r>
+        <w:t>[</w:t>
+      </w:r>
+      <w:proofErr w:type="gramEnd"/>
+      <w:r>
+        <w:t>0];</w:t>
       </w:r>
     </w:p>
     <w:p>
@@ -147,22 +268,54 @@
     </w:p>
     <w:p>
       <w:r>
-        <w:t>Int *ptr = &amp;value;</w:t>
-      </w:r>
-    </w:p>
-    <w:p>
-      <w:r>
-        <w:t xml:space="preserve">What type of data I am sure here </w:t>
-      </w:r>
-    </w:p>
-    <w:p>
-      <w:r>
-        <w:t>How much bytes have to consider</w:t>
-      </w:r>
-    </w:p>
-    <w:p>
-      <w:r>
-        <w:t>Pointer ptr = &amp;value;</w:t>
+        <w:t>Int *</w:t>
+      </w:r>
+      <w:proofErr w:type="spellStart"/>
+      <w:r>
+        <w:t>ptr</w:t>
+      </w:r>
+      <w:proofErr w:type="spellEnd"/>
+      <w:r>
+        <w:t xml:space="preserve"> = &amp;value;</w:t>
+      </w:r>
+    </w:p>
+    <w:p>
+      <w:r>
+        <w:t xml:space="preserve">What type of data I am </w:t>
+      </w:r>
+      <w:proofErr w:type="gramStart"/>
+      <w:r>
+        <w:t>sure</w:t>
+      </w:r>
+      <w:proofErr w:type="gramEnd"/>
+      <w:r>
+        <w:t xml:space="preserve"> here </w:t>
+      </w:r>
+    </w:p>
+    <w:p>
+      <w:r>
+        <w:t xml:space="preserve">How much bytes </w:t>
+      </w:r>
+      <w:proofErr w:type="gramStart"/>
+      <w:r>
+        <w:t>have to</w:t>
+      </w:r>
+      <w:proofErr w:type="gramEnd"/>
+      <w:r>
+        <w:t xml:space="preserve"> consider</w:t>
+      </w:r>
+    </w:p>
+    <w:p>
+      <w:r>
+        <w:t xml:space="preserve">Pointer </w:t>
+      </w:r>
+      <w:proofErr w:type="spellStart"/>
+      <w:r>
+        <w:t>ptr</w:t>
+      </w:r>
+      <w:proofErr w:type="spellEnd"/>
+      <w:r>
+        <w:t xml:space="preserve"> = &amp;value;</w:t>
       </w:r>
     </w:p>
     <w:p>
@@ -172,21 +325,47 @@
     </w:p>
     <w:p>
       <w:r>
-        <w:t>Int *ptr = &amp;I;</w:t>
-      </w:r>
-    </w:p>
-    <w:p/>
-    <w:p/>
-    <w:p>
-      <w:r>
-        <w:t>Int *ptr = &amp;I;</w:t>
-      </w:r>
-    </w:p>
-    <w:p>
-      <w:r>
-        <w:t>Int ** ptr2 = &amp;ptr;</w:t>
-      </w:r>
-    </w:p>
+        <w:t>Int *</w:t>
+      </w:r>
+      <w:proofErr w:type="spellStart"/>
+      <w:r>
+        <w:t>ptr</w:t>
+      </w:r>
+      <w:proofErr w:type="spellEnd"/>
+      <w:r>
+        <w:t xml:space="preserve"> = &amp;I;</w:t>
+      </w:r>
+    </w:p>
+    <w:p/>
+    <w:p/>
+    <w:p>
+      <w:r>
+        <w:t>Int *</w:t>
+      </w:r>
+      <w:proofErr w:type="spellStart"/>
+      <w:r>
+        <w:t>ptr</w:t>
+      </w:r>
+      <w:proofErr w:type="spellEnd"/>
+      <w:r>
+        <w:t xml:space="preserve"> = &amp;I;</w:t>
+      </w:r>
+    </w:p>
+    <w:p>
+      <w:r>
+        <w:t>Int ** ptr2 = &amp;</w:t>
+      </w:r>
+      <w:proofErr w:type="spellStart"/>
+      <w:r>
+        <w:t>ptr</w:t>
+      </w:r>
+      <w:proofErr w:type="spellEnd"/>
+      <w:r>
+        <w:t>;</w:t>
+      </w:r>
+    </w:p>
+    <w:p/>
+    <w:p/>
     <w:p/>
     <w:p/>
     <w:p/>

</xml_diff>